<commit_message>
feat(docx): professional styling — CJK typography, grid tables, meta line, separators
</commit_message>
<xml_diff>
--- a/server/memodocx/assets/reference.docx
+++ b/server/memodocx/assets/reference.docx
@@ -547,15 +547,15 @@
   <w:docDefaults>
     <w:rPrDefault>
       <w:rPr>
-        <w:rFonts w:ascii="Calibri" w:hAnsi="Calibri" w:eastAsia="Microsoft YaHei" w:cs="Calibri"/>
-        <w:sz w:val="24"/>
-        <w:szCs w:val="24"/>
+        <w:rFonts w:ascii="Arial" w:hAnsi="Arial" w:eastAsia="PingFang SC" w:cs="Arial"/>
+        <w:sz w:val="21"/>
+        <w:szCs w:val="21"/>
         <w:lang w:val="en-US" w:eastAsia="zh-CN" w:bidi="ar-SA"/>
       </w:rPr>
     </w:rPrDefault>
     <w:pPrDefault>
       <w:pPr>
-        <w:spacing w:after="200"/>
+        <w:spacing w:after="120" w:line="348" w:lineRule="auto"/>
       </w:pPr>
     </w:pPrDefault>
   </w:docDefaults>
@@ -563,6 +563,15 @@
   <w:style w:type="paragraph" w:default="1" w:styleId="Normal">
     <w:name w:val="Normal"/>
     <w:qFormat/>
+    <w:pPr>
+      <w:spacing w:after="120" w:line="348" w:lineRule="auto"/>
+    </w:pPr>
+    <w:rPr>
+      <w:rFonts w:ascii="Arial" w:hAnsi="Arial" w:eastAsia="PingFang SC" w:cs="Arial"/>
+      <w:color w:val="262626"/>
+      <w:sz w:val="21"/>
+      <w:szCs w:val="21"/>
+    </w:rPr>
   </w:style>
   <w:style w:type="paragraph" w:styleId="BodyText">
     <w:name w:val="Body Text"/>
@@ -570,7 +579,7 @@
     <w:link w:val="BodyTextChar"/>
     <w:qFormat/>
     <w:pPr>
-      <w:spacing w:before="180" w:after="180"/>
+      <w:spacing w:before="0" w:after="120"/>
     </w:pPr>
   </w:style>
   <w:style w:type="paragraph" w:customStyle="1" w:styleId="FirstParagraph">
@@ -582,28 +591,31 @@
   <w:style w:type="paragraph" w:customStyle="1" w:styleId="Compact">
     <w:name w:val="Compact"/>
     <w:basedOn w:val="BodyText"/>
-    <w:qFormat/>
-    <w:pPr>
-      <w:spacing w:before="36" w:after="36"/>
-    </w:pPr>
-  </w:style>
-  <w:style w:type="paragraph" w:styleId="Title">
+    <w:next w:val="Compact"/>
+    <w:qFormat/>
+    <w:pPr>
+      <w:spacing w:before="0" w:after="40" w:line="312" w:lineRule="auto"/>
+    </w:pPr>
+    <w:rPr/>
+  </w:style>
+  <w:style w:type="paragraph" w:customStyle="1" w:styleId="Title">
     <w:name w:val="Title"/>
     <w:basedOn w:val="Normal"/>
     <w:next w:val="BodyText"/>
-    <w:link w:val="TitleChar"/>
-    <w:uiPriority w:val="10"/>
-    <w:qFormat/>
-    <w:rsid w:val="00A10FD9"/>
-    <w:pPr>
-      <w:spacing w:after="80" w:line="240" w:lineRule="auto"/>
-      <w:contextualSpacing/>
-      <w:jc w:val="center"/>
-    </w:pPr>
-    <w:rPr>
-      <w:rFonts w:asciiTheme="majorHAnsi" w:eastAsiaTheme="majorEastAsia" w:hAnsiTheme="majorHAnsi" w:cstheme="majorBidi"/>
-      <w:sz w:val="56"/>
-      <w:szCs w:val="56"/>
+    <w:qFormat/>
+    <w:pPr>
+      <w:spacing w:before="0" w:after="360" w:line="240" w:lineRule="auto"/>
+      <w:jc w:val="left"/>
+      <w:pBdr>
+        <w:bottom w:val="single" w:sz="12" w:space="8" w:color="1F3A5F"/>
+      </w:pBdr>
+    </w:pPr>
+    <w:rPr>
+      <w:rFonts w:ascii="Arial" w:hAnsi="Arial" w:eastAsia="PingFang SC" w:cs="Arial"/>
+      <w:b/>
+      <w:color w:val="1F3A5F"/>
+      <w:sz w:val="40"/>
+      <w:szCs w:val="40"/>
     </w:rPr>
   </w:style>
   <w:style w:type="character" w:customStyle="1" w:styleId="TitleChar">
@@ -726,19 +738,21 @@
     <w:next w:val="BodyText"/>
     <w:link w:val="Heading1Char"/>
     <w:uiPriority w:val="9"/>
-    <w:qFormat/>
-    <w:rsid w:val="00A10FD9"/>
+    <w:unhideWhenUsed/>
+    <w:qFormat/>
     <w:pPr>
       <w:keepNext/>
       <w:keepLines/>
-      <w:spacing w:before="360" w:after="80"/>
+      <w:spacing w:before="240" w:after="40" w:line="300" w:lineRule="auto"/>
       <w:outlineLvl w:val="0"/>
     </w:pPr>
     <w:rPr>
-      <w:rFonts w:asciiTheme="majorHAnsi" w:eastAsiaTheme="majorEastAsia" w:hAnsiTheme="majorHAnsi" w:cstheme="majorBidi"/>
-      <w:color w:val="0F4761" w:themeColor="accent1" w:themeShade="BF"/>
-      <w:sz w:val="40"/>
-      <w:szCs w:val="40"/>
+      <w:rFonts w:ascii="Arial" w:hAnsi="Arial" w:eastAsia="PingFang SC" w:cs="Arial"/>
+      <w:b/>
+      <w:bCs/>
+      <w:color w:val="1F3A5F"/>
+      <w:sz w:val="26"/>
+      <w:szCs w:val="26"/>
     </w:rPr>
   </w:style>
   <w:style w:type="paragraph" w:styleId="Heading2">
@@ -747,21 +761,21 @@
     <w:next w:val="BodyText"/>
     <w:link w:val="Heading2Char"/>
     <w:uiPriority w:val="9"/>
-    <w:semiHidden/>
     <w:unhideWhenUsed/>
     <w:qFormat/>
-    <w:rsid w:val="00A10FD9"/>
     <w:pPr>
       <w:keepNext/>
       <w:keepLines/>
-      <w:spacing w:before="160" w:after="80"/>
+      <w:spacing w:before="240" w:after="80" w:line="300" w:lineRule="auto"/>
       <w:outlineLvl w:val="1"/>
     </w:pPr>
     <w:rPr>
-      <w:rFonts w:asciiTheme="majorHAnsi" w:eastAsiaTheme="majorEastAsia" w:hAnsiTheme="majorHAnsi" w:cstheme="majorBidi"/>
-      <w:color w:val="0F4761" w:themeColor="accent1" w:themeShade="BF"/>
-      <w:sz w:val="32"/>
-      <w:szCs w:val="32"/>
+      <w:rFonts w:ascii="Arial" w:hAnsi="Arial" w:eastAsia="PingFang SC" w:cs="Arial"/>
+      <w:b/>
+      <w:bCs/>
+      <w:color w:val="262626"/>
+      <w:sz w:val="24"/>
+      <w:szCs w:val="24"/>
     </w:rPr>
   </w:style>
   <w:style w:type="paragraph" w:styleId="Heading3">
@@ -770,21 +784,21 @@
     <w:next w:val="BodyText"/>
     <w:link w:val="Heading3Char"/>
     <w:uiPriority w:val="9"/>
-    <w:semiHidden/>
     <w:unhideWhenUsed/>
     <w:qFormat/>
-    <w:rsid w:val="00A10FD9"/>
     <w:pPr>
       <w:keepNext/>
       <w:keepLines/>
-      <w:spacing w:before="160" w:after="80"/>
+      <w:spacing w:before="200" w:after="60" w:line="300" w:lineRule="auto"/>
       <w:outlineLvl w:val="2"/>
     </w:pPr>
     <w:rPr>
-      <w:rFonts w:eastAsiaTheme="majorEastAsia" w:cstheme="majorBidi"/>
-      <w:color w:val="0F4761" w:themeColor="accent1" w:themeShade="BF"/>
-      <w:sz w:val="28"/>
-      <w:szCs w:val="28"/>
+      <w:rFonts w:ascii="Arial" w:hAnsi="Arial" w:eastAsia="PingFang SC" w:cs="Arial"/>
+      <w:b/>
+      <w:bCs/>
+      <w:color w:val="262626"/>
+      <w:sz w:val="22"/>
+      <w:szCs w:val="22"/>
     </w:rPr>
   </w:style>
   <w:style w:type="paragraph" w:styleId="Heading4">
@@ -793,21 +807,21 @@
     <w:next w:val="BodyText"/>
     <w:link w:val="Heading4Char"/>
     <w:uiPriority w:val="9"/>
-    <w:semiHidden/>
     <w:unhideWhenUsed/>
     <w:qFormat/>
-    <w:rsid w:val="00A10FD9"/>
     <w:pPr>
       <w:keepNext/>
       <w:keepLines/>
-      <w:spacing w:before="80" w:after="40"/>
+      <w:spacing w:before="160" w:after="40" w:line="300" w:lineRule="auto"/>
       <w:outlineLvl w:val="3"/>
     </w:pPr>
     <w:rPr>
-      <w:rFonts w:eastAsiaTheme="majorEastAsia" w:cstheme="majorBidi"/>
-      <w:i/>
-      <w:iCs/>
-      <w:color w:val="0F4761" w:themeColor="accent1" w:themeShade="BF"/>
+      <w:rFonts w:ascii="Arial" w:hAnsi="Arial" w:eastAsia="PingFang SC" w:cs="Arial"/>
+      <w:b/>
+      <w:bCs/>
+      <w:color w:val="262626"/>
+      <w:sz w:val="21"/>
+      <w:szCs w:val="21"/>
     </w:rPr>
   </w:style>
   <w:style w:type="paragraph" w:styleId="Heading5">
@@ -816,19 +830,21 @@
     <w:next w:val="BodyText"/>
     <w:link w:val="Heading5Char"/>
     <w:uiPriority w:val="9"/>
-    <w:semiHidden/>
     <w:unhideWhenUsed/>
     <w:qFormat/>
-    <w:rsid w:val="00A10FD9"/>
     <w:pPr>
       <w:keepNext/>
       <w:keepLines/>
-      <w:spacing w:before="80" w:after="40"/>
+      <w:spacing w:before="120" w:after="40" w:line="300" w:lineRule="auto"/>
       <w:outlineLvl w:val="4"/>
     </w:pPr>
     <w:rPr>
-      <w:rFonts w:eastAsiaTheme="majorEastAsia" w:cstheme="majorBidi"/>
-      <w:color w:val="0F4761" w:themeColor="accent1" w:themeShade="BF"/>
+      <w:rFonts w:ascii="Arial" w:hAnsi="Arial" w:eastAsia="PingFang SC" w:cs="Arial"/>
+      <w:b/>
+      <w:bCs/>
+      <w:color w:val="595959"/>
+      <w:sz w:val="21"/>
+      <w:szCs w:val="21"/>
     </w:rPr>
   </w:style>
   <w:style w:type="paragraph" w:styleId="Heading6">
@@ -837,21 +853,21 @@
     <w:next w:val="BodyText"/>
     <w:link w:val="Heading6Char"/>
     <w:uiPriority w:val="9"/>
-    <w:semiHidden/>
     <w:unhideWhenUsed/>
     <w:qFormat/>
-    <w:rsid w:val="00A10FD9"/>
     <w:pPr>
       <w:keepNext/>
       <w:keepLines/>
-      <w:spacing w:before="40" w:after="0"/>
+      <w:spacing w:before="120" w:after="40" w:line="300" w:lineRule="auto"/>
       <w:outlineLvl w:val="5"/>
     </w:pPr>
     <w:rPr>
-      <w:rFonts w:eastAsiaTheme="majorEastAsia" w:cstheme="majorBidi"/>
-      <w:i/>
-      <w:iCs/>
-      <w:color w:val="595959" w:themeColor="text1" w:themeTint="A6"/>
+      <w:rFonts w:ascii="Arial" w:hAnsi="Arial" w:eastAsia="PingFang SC" w:cs="Arial"/>
+      <w:b/>
+      <w:bCs/>
+      <w:color w:val="595959"/>
+      <w:sz w:val="21"/>
+      <w:szCs w:val="21"/>
     </w:rPr>
   </w:style>
   <w:style w:type="paragraph" w:styleId="Heading7">
@@ -925,12 +941,7 @@
     <w:link w:val="Heading1"/>
     <w:uiPriority w:val="9"/>
     <w:rsid w:val="00A10FD9"/>
-    <w:rPr>
-      <w:rFonts w:asciiTheme="majorHAnsi" w:eastAsiaTheme="majorEastAsia" w:hAnsiTheme="majorHAnsi" w:cstheme="majorBidi"/>
-      <w:color w:val="0F4761" w:themeColor="accent1" w:themeShade="BF"/>
-      <w:sz w:val="40"/>
-      <w:szCs w:val="40"/>
-    </w:rPr>
+    <w:rPr/>
   </w:style>
   <w:style w:type="character" w:customStyle="1" w:styleId="Heading2Char">
     <w:name w:val="Heading 2 Char"/>
@@ -939,12 +950,7 @@
     <w:uiPriority w:val="9"/>
     <w:semiHidden/>
     <w:rsid w:val="00A10FD9"/>
-    <w:rPr>
-      <w:rFonts w:asciiTheme="majorHAnsi" w:eastAsiaTheme="majorEastAsia" w:hAnsiTheme="majorHAnsi" w:cstheme="majorBidi"/>
-      <w:color w:val="0F4761" w:themeColor="accent1" w:themeShade="BF"/>
-      <w:sz w:val="32"/>
-      <w:szCs w:val="32"/>
-    </w:rPr>
+    <w:rPr/>
   </w:style>
   <w:style w:type="character" w:customStyle="1" w:styleId="Heading3Char">
     <w:name w:val="Heading 3 Char"/>
@@ -953,12 +959,7 @@
     <w:uiPriority w:val="9"/>
     <w:semiHidden/>
     <w:rsid w:val="00A10FD9"/>
-    <w:rPr>
-      <w:rFonts w:eastAsiaTheme="majorEastAsia" w:cstheme="majorBidi"/>
-      <w:color w:val="0F4761" w:themeColor="accent1" w:themeShade="BF"/>
-      <w:sz w:val="28"/>
-      <w:szCs w:val="28"/>
-    </w:rPr>
+    <w:rPr/>
   </w:style>
   <w:style w:type="character" w:customStyle="1" w:styleId="Heading4Char">
     <w:name w:val="Heading 4 Char"/>
@@ -967,12 +968,7 @@
     <w:uiPriority w:val="9"/>
     <w:semiHidden/>
     <w:rsid w:val="00A10FD9"/>
-    <w:rPr>
-      <w:rFonts w:eastAsiaTheme="majorEastAsia" w:cstheme="majorBidi"/>
-      <w:i/>
-      <w:iCs/>
-      <w:color w:val="0F4761" w:themeColor="accent1" w:themeShade="BF"/>
-    </w:rPr>
+    <w:rPr/>
   </w:style>
   <w:style w:type="character" w:customStyle="1" w:styleId="Heading5Char">
     <w:name w:val="Heading 5 Char"/>
@@ -981,10 +977,7 @@
     <w:uiPriority w:val="9"/>
     <w:semiHidden/>
     <w:rsid w:val="00A10FD9"/>
-    <w:rPr>
-      <w:rFonts w:eastAsiaTheme="majorEastAsia" w:cstheme="majorBidi"/>
-      <w:color w:val="0F4761" w:themeColor="accent1" w:themeShade="BF"/>
-    </w:rPr>
+    <w:rPr/>
   </w:style>
   <w:style w:type="character" w:customStyle="1" w:styleId="Heading6Char">
     <w:name w:val="Heading 6 Char"/>
@@ -993,12 +986,7 @@
     <w:uiPriority w:val="9"/>
     <w:semiHidden/>
     <w:rsid w:val="00A10FD9"/>
-    <w:rPr>
-      <w:rFonts w:eastAsiaTheme="majorEastAsia" w:cstheme="majorBidi"/>
-      <w:i/>
-      <w:iCs/>
-      <w:color w:val="595959" w:themeColor="text1" w:themeTint="A6"/>
-    </w:rPr>
+    <w:rPr/>
   </w:style>
   <w:style w:type="character" w:customStyle="1" w:styleId="Heading7Char">
     <w:name w:val="Heading 7 Char"/>
@@ -1007,10 +995,7 @@
     <w:uiPriority w:val="9"/>
     <w:semiHidden/>
     <w:rsid w:val="00A10FD9"/>
-    <w:rPr>
-      <w:rFonts w:eastAsiaTheme="majorEastAsia" w:cstheme="majorBidi"/>
-      <w:color w:val="595959" w:themeColor="text1" w:themeTint="A6"/>
-    </w:rPr>
+    <w:rPr/>
   </w:style>
   <w:style w:type="character" w:customStyle="1" w:styleId="Heading8Char">
     <w:name w:val="Heading 8 Char"/>
@@ -1019,12 +1004,7 @@
     <w:uiPriority w:val="9"/>
     <w:semiHidden/>
     <w:rsid w:val="00A10FD9"/>
-    <w:rPr>
-      <w:rFonts w:eastAsiaTheme="majorEastAsia" w:cstheme="majorBidi"/>
-      <w:i/>
-      <w:iCs/>
-      <w:color w:val="272727" w:themeColor="text1" w:themeTint="D8"/>
-    </w:rPr>
+    <w:rPr/>
   </w:style>
   <w:style w:type="character" w:customStyle="1" w:styleId="Heading9Char">
     <w:name w:val="Heading 9 Char"/>
@@ -1033,22 +1013,23 @@
     <w:uiPriority w:val="9"/>
     <w:semiHidden/>
     <w:rsid w:val="00A10FD9"/>
-    <w:rPr>
-      <w:rFonts w:eastAsiaTheme="majorEastAsia" w:cstheme="majorBidi"/>
-      <w:color w:val="272727" w:themeColor="text1" w:themeTint="D8"/>
-    </w:rPr>
-  </w:style>
-  <w:style w:type="paragraph" w:styleId="BlockText">
+    <w:rPr/>
+  </w:style>
+  <w:style w:type="paragraph" w:customStyle="1" w:styleId="BlockText">
     <w:name w:val="Block Text"/>
     <w:basedOn w:val="BodyText"/>
     <w:next w:val="BodyText"/>
-    <w:uiPriority w:val="9"/>
-    <w:unhideWhenUsed/>
-    <w:qFormat/>
-    <w:pPr>
-      <w:spacing w:before="100" w:after="100"/>
-      <w:ind w:firstLine="0" w:left="480" w:right="480"/>
-    </w:pPr>
+    <w:qFormat/>
+    <w:pPr>
+      <w:pBdr>
+        <w:left w:val="single" w:sz="18" w:space="8" w:color="BFBFBF"/>
+      </w:pBdr>
+      <w:spacing w:before="60" w:after="60"/>
+      <w:ind w:left="240" w:right="0" w:firstLine="0"/>
+    </w:pPr>
+    <w:rPr>
+      <w:color w:val="595959"/>
+    </w:rPr>
   </w:style>
   <w:style w:type="paragraph" w:styleId="FootnoteText">
     <w:name w:val="Footnote Text"/>
@@ -1078,31 +1059,45 @@
   <w:style w:type="table" w:default="1" w:styleId="Table">
     <w:name w:val="Table"/>
     <w:basedOn w:val="TableNormal"/>
-    <w:semiHidden/>
-    <w:unhideWhenUsed/>
-    <w:qFormat/>
+    <w:uiPriority w:val="59"/>
+    <w:qFormat/>
+    <w:pPr>
+      <w:spacing w:before="0" w:after="0" w:line="300" w:lineRule="auto"/>
+    </w:pPr>
+    <w:rPr>
+      <w:sz w:val="20"/>
+      <w:szCs w:val="20"/>
+    </w:rPr>
     <w:tblPr>
       <w:tblInd w:w="0" w:type="dxa"/>
+      <w:tblBorders>
+        <w:top w:val="single" w:sz="4" w:space="0" w:color="D9D9D9"/>
+        <w:left w:val="single" w:sz="4" w:space="0" w:color="D9D9D9"/>
+        <w:bottom w:val="single" w:sz="4" w:space="0" w:color="D9D9D9"/>
+        <w:right w:val="single" w:sz="4" w:space="0" w:color="D9D9D9"/>
+        <w:insideH w:val="single" w:sz="4" w:space="0" w:color="D9D9D9"/>
+        <w:insideV w:val="single" w:sz="4" w:space="0" w:color="D9D9D9"/>
+      </w:tblBorders>
       <w:tblCellMar>
-        <w:top w:w="0" w:type="dxa"/>
-        <w:left w:w="108" w:type="dxa"/>
-        <w:bottom w:w="0" w:type="dxa"/>
-        <w:right w:w="108" w:type="dxa"/>
+        <w:top w:w="80" w:type="dxa"/>
+        <w:left w:w="140" w:type="dxa"/>
+        <w:bottom w:w="80" w:type="dxa"/>
+        <w:right w:w="140" w:type="dxa"/>
       </w:tblCellMar>
     </w:tblPr>
     <w:tblStylePr w:type="firstRow">
-      <w:tblPr>
-        <w:jc w:val="left"/>
-        <w:tblInd w:w="0" w:type="dxa"/>
-      </w:tblPr>
-      <w:trPr>
-        <w:jc w:val="left"/>
-      </w:trPr>
+      <w:rPr>
+        <w:b/>
+        <w:bCs/>
+        <w:color w:val="1F2937"/>
+      </w:rPr>
       <w:tcPr>
-        <w:tcBorders>
-          <w:bottom w:val="single"/>
-        </w:tcBorders>
-        <w:vAlign w:val="bottom"/>
+        <w:shd w:val="clear" w:color="auto" w:fill="EEF2F6"/>
+      </w:tcPr>
+    </w:tblStylePr>
+    <w:tblStylePr w:type="band2Horz">
+      <w:tcPr>
+        <w:shd w:val="clear" w:color="auto" w:fill="FAFBFC"/>
       </w:tcPr>
     </w:tblStylePr>
   </w:style>
@@ -1143,18 +1138,39 @@
   </w:style>
   <w:style w:type="paragraph" w:customStyle="1" w:styleId="ImageCaption">
     <w:name w:val="Image Caption"/>
-    <w:basedOn w:val="Caption"/>
+    <w:basedOn w:val="BodyText"/>
+    <w:next w:val="BodyText"/>
+    <w:qFormat/>
+    <w:pPr>
+      <w:spacing w:before="40" w:after="160"/>
+      <w:jc w:val="center"/>
+    </w:pPr>
+    <w:rPr>
+      <w:color w:val="8C8C8C"/>
+      <w:sz w:val="18"/>
+    </w:rPr>
   </w:style>
   <w:style w:type="paragraph" w:customStyle="1" w:styleId="Figure">
     <w:name w:val="Figure"/>
-    <w:basedOn w:val="Normal"/>
+    <w:basedOn w:val="BodyText"/>
+    <w:next w:val="BodyText"/>
+    <w:qFormat/>
+    <w:pPr>
+      <w:spacing w:before="80" w:after="80"/>
+      <w:jc w:val="center"/>
+    </w:pPr>
+    <w:rPr/>
   </w:style>
   <w:style w:type="paragraph" w:customStyle="1" w:styleId="CaptionedFigure">
     <w:name w:val="Captioned Figure"/>
-    <w:basedOn w:val="Figure"/>
+    <w:basedOn w:val="BodyText"/>
+    <w:next w:val="BodyText"/>
+    <w:qFormat/>
     <w:pPr>
       <w:keepNext/>
-    </w:pPr>
+      <w:jc w:val="center"/>
+    </w:pPr>
+    <w:rPr/>
   </w:style>
   <w:style w:type="character" w:customStyle="1" w:styleId="BodyTextChar">
     <w:name w:val="Body Text Char"/>
@@ -1163,10 +1179,13 @@
   </w:style>
   <w:style w:type="character" w:customStyle="1" w:styleId="VerbatimChar">
     <w:name w:val="Verbatim Char"/>
-    <w:basedOn w:val="BodyTextChar"/>
-    <w:rPr>
-      <w:rFonts w:ascii="Consolas" w:hAnsi="Consolas" w:eastAsia="SimSun"/>
-      <w:sz w:val="22"/>
+    <w:basedOn w:val="DefaultParagraphFont"/>
+    <w:rPr>
+      <w:rFonts w:ascii="Consolas" w:hAnsi="Consolas" w:eastAsia="PingFang SC" w:cs="Consolas"/>
+      <w:color w:val="C7254E"/>
+      <w:sz w:val="19"/>
+      <w:szCs w:val="19"/>
+      <w:shd w:val="clear" w:color="auto" w:fill="F3F4F6"/>
     </w:rPr>
   </w:style>
   <w:style w:type="character" w:customStyle="1" w:styleId="SectionNumber">
@@ -1182,9 +1201,10 @@
   </w:style>
   <w:style w:type="character" w:styleId="Hyperlink">
     <w:name w:val="Hyperlink"/>
-    <w:basedOn w:val="BodyTextChar"/>
-    <w:rPr>
-      <w:color w:val="4F81BD" w:themeColor="accent1"/>
+    <w:basedOn w:val="DefaultParagraphFont"/>
+    <w:rPr>
+      <w:color w:val="2F6FB2"/>
+      <w:u w:val="none"/>
     </w:rPr>
   </w:style>
   <w:style w:type="paragraph" w:styleId="TOCHeading">
@@ -1203,6 +1223,59 @@
       <w:b w:val="0"/>
       <w:bCs w:val="0"/>
       <w:color w:val="365F91" w:themeColor="accent1" w:themeShade="BF"/>
+    </w:rPr>
+  </w:style>
+  <w:style w:type="paragraph" w:customStyle="1" w:styleId="MemoMeta">
+    <w:name w:val="Memo Meta"/>
+    <w:basedOn w:val="Normal"/>
+    <w:next w:val="BodyText"/>
+    <w:qFormat/>
+    <w:pPr>
+      <w:spacing w:before="0" w:after="200"/>
+    </w:pPr>
+    <w:rPr>
+      <w:color w:val="8C8C8C"/>
+      <w:sz w:val="18"/>
+      <w:szCs w:val="18"/>
+    </w:rPr>
+  </w:style>
+  <w:style w:type="paragraph" w:customStyle="1" w:styleId="MemoSeparator">
+    <w:name w:val="Memo Separator"/>
+    <w:basedOn w:val="Normal"/>
+    <w:next w:val="BodyText"/>
+    <w:qFormat/>
+    <w:pPr>
+      <w:pBdr>
+        <w:bottom w:val="single" w:sz="4" w:space="0" w:color="D9D9D9"/>
+      </w:pBdr>
+      <w:spacing w:before="240" w:after="240" w:line="120" w:lineRule="exact"/>
+    </w:pPr>
+    <w:rPr>
+      <w:sz w:val="4"/>
+    </w:rPr>
+  </w:style>
+  <w:style w:type="paragraph" w:customStyle="1" w:styleId="SourceCode">
+    <w:name w:val="Source Code"/>
+    <w:basedOn w:val="Normal"/>
+    <w:next w:val="SourceCode"/>
+    <w:link w:val="VerbatimChar"/>
+    <w:qFormat/>
+    <w:pPr>
+      <w:pBdr>
+        <w:top w:val="single" w:sz="4" w:space="4" w:color="EDEDED"/>
+        <w:left w:val="single" w:sz="4" w:space="4" w:color="EDEDED"/>
+        <w:bottom w:val="single" w:sz="4" w:space="4" w:color="EDEDED"/>
+        <w:right w:val="single" w:sz="4" w:space="4" w:color="EDEDED"/>
+      </w:pBdr>
+      <w:shd w:val="clear" w:color="auto" w:fill="F6F7F9"/>
+      <w:wordWrap w:val="off"/>
+      <w:spacing w:before="0" w:after="0" w:line="264" w:lineRule="auto"/>
+      <w:ind w:left="100" w:right="100"/>
+    </w:pPr>
+    <w:rPr>
+      <w:rFonts w:ascii="Consolas" w:hAnsi="Consolas" w:eastAsia="PingFang SC" w:cs="Consolas"/>
+      <w:sz w:val="18"/>
+      <w:szCs w:val="18"/>
     </w:rPr>
   </w:style>
 </w:styles>

</xml_diff>